<commit_message>
docs: clarify deferrals and foreground active Receiving palette
</commit_message>
<xml_diff>
--- a/docs/Sorting_Apocalypse_Preliminary_GDD_v0.12.docx
+++ b/docs/Sorting_Apocalypse_Preliminary_GDD_v0.12.docx
@@ -404,7 +404,7 @@
                 <w:color w:val="25323A"/>
                 <w:sz w:val="18"/>
               </w:rPr>
-              <w:t>Deferred</w:t>
+              <w:t>Deferred / later work</w:t>
             </w:r>
           </w:p>
         </w:tc>
@@ -427,7 +427,56 @@
                 <w:color w:val="25323A"/>
                 <w:sz w:val="18"/>
               </w:rPr>
-              <w:t>Intentionally outside the first-release target unless later reassessed.</w:t>
+              <w:t>Outside the current prototype/milestone; may still be intended for the initial release. The relevant roadmap or section determines release status; this label alone does not exclude it from launch.</w:t>
+            </w:r>
+          </w:p>
+        </w:tc>
+      </w:tr>
+      <w:tr>
+        <w:trPr>
+          <w:cantSplit/>
+        </w:trPr>
+        <w:tc>
+          <w:tcPr>
+            <w:tcW w:type="dxa" w:w="2995"/>
+            <w:vAlign w:val="top"/>
+          </w:tcPr>
+          <w:p>
+            <w:pPr>
+              <w:pStyle w:val="TableText"/>
+              <w:keepNext w:val="0"/>
+              <w:widowControl/>
+            </w:pPr>
+            <w:r>
+              <w:rPr>
+                <w:rFonts w:ascii="Lato" w:hAnsi="Lato"/>
+                <w:b/>
+                <w:color w:val="25323A"/>
+                <w:sz w:val="18"/>
+              </w:rPr>
+              <w:t>Beyond first release</w:t>
+            </w:r>
+          </w:p>
+        </w:tc>
+        <w:tc>
+          <w:tcPr>
+            <w:tcW w:type="dxa" w:w="6869"/>
+            <w:vAlign w:val="top"/>
+          </w:tcPr>
+          <w:p>
+            <w:pPr>
+              <w:pStyle w:val="TableText"/>
+              <w:keepNext w:val="0"/>
+              <w:widowControl/>
+            </w:pPr>
+            <w:r>
+              <w:rPr>
+                <w:rFonts w:ascii="Lato" w:hAnsi="Lato"/>
+                <w:b w:val="0"/>
+                <w:color w:val="25323A"/>
+                <w:sz w:val="18"/>
+              </w:rPr>
+              <w:t>Explicitly outside the initial-release target unless separately reconsidered.</w:t>
             </w:r>
           </w:p>
         </w:tc>

</xml_diff>